<commit_message>
Replace motion volume gesture with a dedicated button-controlled page
</commit_message>
<xml_diff>
--- a/docs/terminal_use.docx
+++ b/docs/terminal_use.docx
@@ -315,7 +315,7 @@
               <w:rPr>
                 <w:sz w:val="23"/>
               </w:rPr>
-              <w:t>Hold it while moving the remote up or down to change sound volume</w:t>
+              <w:t>Open/close volume; left/right changes it in 5% steps</w:t>
             </w:r>
           </w:p>
         </w:tc>
@@ -453,7 +453,7 @@
         <w:pageBreakBefore w:val="0"/>
       </w:pPr>
       <w:r>
-        <w:t>Hold the middle button. Move the remote gently up for louder sound or down for quieter sound, in 5% steps. The vertical bar at the right shows the volume. Release the button to stop changing it; the bar disappears shortly afterward.</w:t>
+        <w:t>Press the middle button to open the volume page. Click left for quieter sound or right for louder sound, in 5% steps. The horizontal bar shows the volume. Press middle again to return. Calls continue while adjusting volume; moving the remote has no effect.</w:t>
       </w:r>
     </w:p>
     <w:p>
@@ -461,7 +461,7 @@
         <w:pageBreakBefore w:val="0"/>
       </w:pPr>
       <w:r>
-        <w:t>The movement is relative: the remote's starting angle does not set the volume. Left and right motion does not change it. This adjusts the sound you hear, not the other person's microphone. For a saved starting volume, ask your helper to change Speaker volume in Settings.</w:t>
+        <w:t>The volume page changes the sound you hear, not microphone volume. It stays open until you press middle again. Incoming calls close it automatically. For a saved starting volume, change Speaker volume in Settings.</w:t>
       </w:r>
     </w:p>
     <w:p>

</xml_diff>

<commit_message>
Select missed caller in the terminal carousel
</commit_message>
<xml_diff>
--- a/docs/terminal_use.docx
+++ b/docs/terminal_use.docx
@@ -547,6 +547,14 @@
         <w:keepLines/>
       </w:pPr>
       <w:r>
+        <w:t>After a missed call, the caller’s portrait is selected automatically so you can easily call them back. Their missed-call badge stays unread until you open their confirmation.</w:t>
+      </w:r>
+    </w:p>
+    <w:p>
+      <w:pPr>
+        <w:keepLines/>
+      </w:pPr>
+      <w:r>
         <w:t>A thin blue bar at the bottom appears after ten seconds without a button press and shows the countdown to returning to TV. A button press restarts the countdown. After any incoming call ends, answered or not, a fresh countdown starts. When it finishes, the TV switches off if it was off before the call, or returns to what you were watching if it was on. Your helper chooses the delay; Never disables automatic return. This works only when automatic TV control passed setup; otherwise use the TV remote.</w:t>
       </w:r>
     </w:p>

</xml_diff>